<commit_message>
Refactor Student Hub Portal: - Removed unused CSS styles from style.css. - Updated Requirement Gathering document to remove unnecessary lines. - Enhanced index.html with improved navigation and content structure. - Created about.html with basic structure. - Developed assignment.html with detailed assignment cards. - Added attendance.html for attendance information display. - Implemented contact.html with a message form and contact details. - Revamped login.html for a better user experience with a new layout. - Created profile.html to display user profile information. - Developed register.html with a structured registration form. - Added result.html to show student results and GPA information. - Added logo image for branding.
</commit_message>
<xml_diff>
--- a/docs/Requirement Gathering.docx
+++ b/docs/Requirement Gathering.docx
@@ -76,14 +76,6 @@
         </w:rPr>
         <w:t xml:space="preserve"> Portal</w:t>
       </w:r>
-    </w:p>
-    <w:p>
-      <w:pPr>
-        <w:ind w:left="0" w:firstLine="0"/>
-        <w:rPr>
-          <w:lang w:val="en-US"/>
-        </w:rPr>
-      </w:pPr>
     </w:p>
     <w:p>
       <w:pPr>
@@ -445,6 +437,7 @@
     </w:p>
     <w:p>
       <w:pPr>
+        <w:jc w:val="left"/>
         <w:rPr>
           <w:b/>
           <w:bCs/>
@@ -454,127 +447,123 @@
       </w:pPr>
       <w:r>
         <w:rPr>
+          <w:rFonts w:ascii="Times New Roman" w:hAnsi="Times New Roman" w:cs="Times New Roman"/>
           <w:b/>
           <w:bCs/>
+          <w:noProof/>
+          <w:sz w:val="24"/>
+          <w:szCs w:val="24"/>
+          <w:lang w:val="en-US"/>
+        </w:rPr>
+        <w:lastRenderedPageBreak/>
+        <w:drawing>
+          <wp:anchor distT="0" distB="0" distL="114300" distR="114300" simplePos="0" relativeHeight="251659264" behindDoc="0" locked="0" layoutInCell="1" allowOverlap="1" wp14:anchorId="2A34B6A9" wp14:editId="0CC23FDA">
+            <wp:simplePos x="0" y="0"/>
+            <wp:positionH relativeFrom="margin">
+              <wp:align>left</wp:align>
+            </wp:positionH>
+            <wp:positionV relativeFrom="paragraph">
+              <wp:posOffset>4550987</wp:posOffset>
+            </wp:positionV>
+            <wp:extent cx="5731510" cy="3618230"/>
+            <wp:effectExtent l="0" t="0" r="2540" b="1270"/>
+            <wp:wrapSquare wrapText="bothSides"/>
+            <wp:docPr id="1139152669" name="Picture 2"/>
+            <wp:cNvGraphicFramePr>
+              <a:graphicFrameLocks xmlns:a="http://schemas.openxmlformats.org/drawingml/2006/main" noChangeAspect="1"/>
+            </wp:cNvGraphicFramePr>
+            <a:graphic xmlns:a="http://schemas.openxmlformats.org/drawingml/2006/main">
+              <a:graphicData uri="http://schemas.openxmlformats.org/drawingml/2006/picture">
+                <pic:pic xmlns:pic="http://schemas.openxmlformats.org/drawingml/2006/picture">
+                  <pic:nvPicPr>
+                    <pic:cNvPr id="1139152669" name="Picture 1139152669"/>
+                    <pic:cNvPicPr/>
+                  </pic:nvPicPr>
+                  <pic:blipFill>
+                    <a:blip r:embed="rId5" cstate="print">
+                      <a:extLst>
+                        <a:ext uri="{28A0092B-C50C-407E-A947-70E740481C1C}">
+                          <a14:useLocalDpi xmlns:a14="http://schemas.microsoft.com/office/drawing/2010/main" val="0"/>
+                        </a:ext>
+                      </a:extLst>
+                    </a:blip>
+                    <a:stretch>
+                      <a:fillRect/>
+                    </a:stretch>
+                  </pic:blipFill>
+                  <pic:spPr>
+                    <a:xfrm>
+                      <a:off x="0" y="0"/>
+                      <a:ext cx="5731510" cy="3618230"/>
+                    </a:xfrm>
+                    <a:prstGeom prst="rect">
+                      <a:avLst/>
+                    </a:prstGeom>
+                  </pic:spPr>
+                </pic:pic>
+              </a:graphicData>
+            </a:graphic>
+          </wp:anchor>
+        </w:drawing>
+      </w:r>
+      <w:r>
+        <w:rPr>
+          <w:b/>
+          <w:bCs/>
+          <w:noProof/>
           <w:sz w:val="32"/>
           <w:szCs w:val="32"/>
         </w:rPr>
-        <w:t>Requirement Analysis</w:t>
+        <w:drawing>
+          <wp:anchor distT="0" distB="0" distL="114300" distR="114300" simplePos="0" relativeHeight="251658240" behindDoc="0" locked="0" layoutInCell="1" allowOverlap="1" wp14:anchorId="714526DC" wp14:editId="66A3D757">
+            <wp:simplePos x="0" y="0"/>
+            <wp:positionH relativeFrom="margin">
+              <wp:align>left</wp:align>
+            </wp:positionH>
+            <wp:positionV relativeFrom="paragraph">
+              <wp:posOffset>404</wp:posOffset>
+            </wp:positionV>
+            <wp:extent cx="5731510" cy="4214495"/>
+            <wp:effectExtent l="0" t="0" r="2540" b="0"/>
+            <wp:wrapSquare wrapText="bothSides"/>
+            <wp:docPr id="1864071236" name="Picture 1"/>
+            <wp:cNvGraphicFramePr>
+              <a:graphicFrameLocks xmlns:a="http://schemas.openxmlformats.org/drawingml/2006/main" noChangeAspect="1"/>
+            </wp:cNvGraphicFramePr>
+            <a:graphic xmlns:a="http://schemas.openxmlformats.org/drawingml/2006/main">
+              <a:graphicData uri="http://schemas.openxmlformats.org/drawingml/2006/picture">
+                <pic:pic xmlns:pic="http://schemas.openxmlformats.org/drawingml/2006/picture">
+                  <pic:nvPicPr>
+                    <pic:cNvPr id="1864071236" name="Picture 1864071236"/>
+                    <pic:cNvPicPr/>
+                  </pic:nvPicPr>
+                  <pic:blipFill>
+                    <a:blip r:embed="rId6" cstate="print">
+                      <a:extLst>
+                        <a:ext uri="{28A0092B-C50C-407E-A947-70E740481C1C}">
+                          <a14:useLocalDpi xmlns:a14="http://schemas.microsoft.com/office/drawing/2010/main" val="0"/>
+                        </a:ext>
+                      </a:extLst>
+                    </a:blip>
+                    <a:stretch>
+                      <a:fillRect/>
+                    </a:stretch>
+                  </pic:blipFill>
+                  <pic:spPr>
+                    <a:xfrm>
+                      <a:off x="0" y="0"/>
+                      <a:ext cx="5731510" cy="4214495"/>
+                    </a:xfrm>
+                    <a:prstGeom prst="rect">
+                      <a:avLst/>
+                    </a:prstGeom>
+                  </pic:spPr>
+                </pic:pic>
+              </a:graphicData>
+            </a:graphic>
+          </wp:anchor>
+        </w:drawing>
       </w:r>
-      <w:r>
-        <w:rPr>
-          <w:b/>
-          <w:bCs/>
-          <w:sz w:val="32"/>
-          <w:szCs w:val="32"/>
-        </w:rPr>
-        <w:t>:</w:t>
-      </w:r>
-    </w:p>
-    <w:p>
-      <w:pPr>
-        <w:pStyle w:val="ListParagraph"/>
-        <w:numPr>
-          <w:ilvl w:val="0"/>
-          <w:numId w:val="10"/>
-        </w:numPr>
-        <w:jc w:val="left"/>
-        <w:rPr>
-          <w:sz w:val="24"/>
-          <w:szCs w:val="24"/>
-        </w:rPr>
-      </w:pPr>
-      <w:r>
-        <w:rPr>
-          <w:sz w:val="24"/>
-          <w:szCs w:val="24"/>
-        </w:rPr>
-        <w:t xml:space="preserve">Home Page </w:t>
-      </w:r>
-      <w:r>
-        <w:rPr>
-          <w:sz w:val="24"/>
-          <w:szCs w:val="24"/>
-        </w:rPr>
-        <w:t>:</w:t>
-      </w:r>
-      <w:r>
-        <w:t xml:space="preserve"> </w:t>
-      </w:r>
-      <w:r>
-        <w:rPr>
-          <w:sz w:val="24"/>
-          <w:szCs w:val="24"/>
-        </w:rPr>
-        <w:t>Display an overview of Student</w:t>
-      </w:r>
-      <w:r>
-        <w:rPr>
-          <w:sz w:val="24"/>
-          <w:szCs w:val="24"/>
-        </w:rPr>
-        <w:t xml:space="preserve"> </w:t>
-      </w:r>
-      <w:r>
-        <w:rPr>
-          <w:sz w:val="24"/>
-          <w:szCs w:val="24"/>
-        </w:rPr>
-        <w:t>Hub</w:t>
-      </w:r>
-      <w:r>
-        <w:rPr>
-          <w:sz w:val="24"/>
-          <w:szCs w:val="24"/>
-        </w:rPr>
-        <w:t xml:space="preserve"> Portal </w:t>
-      </w:r>
-      <w:r>
-        <w:rPr>
-          <w:sz w:val="24"/>
-          <w:szCs w:val="24"/>
-        </w:rPr>
-        <w:t xml:space="preserve"> and provide navigation to all pages.</w:t>
-      </w:r>
-    </w:p>
-    <w:p>
-      <w:pPr>
-        <w:pStyle w:val="ListParagraph"/>
-        <w:numPr>
-          <w:ilvl w:val="0"/>
-          <w:numId w:val="10"/>
-        </w:numPr>
-        <w:jc w:val="left"/>
-        <w:rPr>
-          <w:sz w:val="24"/>
-          <w:szCs w:val="24"/>
-        </w:rPr>
-      </w:pPr>
-      <w:r>
-        <w:rPr>
-          <w:sz w:val="24"/>
-          <w:szCs w:val="24"/>
-        </w:rPr>
-        <w:t>About Page</w:t>
-      </w:r>
-      <w:r>
-        <w:rPr>
-          <w:sz w:val="24"/>
-          <w:szCs w:val="24"/>
-        </w:rPr>
-        <w:t>:</w:t>
-      </w:r>
-    </w:p>
-    <w:p>
-      <w:pPr>
-        <w:jc w:val="left"/>
-        <w:rPr>
-          <w:b/>
-          <w:bCs/>
-          <w:sz w:val="32"/>
-          <w:szCs w:val="32"/>
-        </w:rPr>
-      </w:pPr>
     </w:p>
     <w:p>
       <w:pPr>
@@ -2381,6 +2370,7 @@
   <w:style w:type="character" w:default="1" w:styleId="DefaultParagraphFont">
     <w:name w:val="Default Paragraph Font"/>
     <w:uiPriority w:val="1"/>
+    <w:semiHidden/>
     <w:unhideWhenUsed/>
   </w:style>
   <w:style w:type="table" w:default="1" w:styleId="TableNormal">

</xml_diff>